<commit_message>
Revised Final Summary - added YouTube link
</commit_message>
<xml_diff>
--- a/docs/FINAL_SUMMARY.docx
+++ b/docs/FINAL_SUMMARY.docx
@@ -87,13 +87,7 @@
         <w:rPr>
           <w:sz w:val="28"/>
         </w:rPr>
-        <w:t>December</w:t>
-      </w:r>
-      <w:r>
-        <w:rPr>
-          <w:sz w:val="28"/>
-        </w:rPr>
-        <w:t xml:space="preserve"> 2025</w:t>
+        <w:t>December 2025</w:t>
       </w:r>
     </w:p>
     <w:p>
@@ -139,16 +133,7 @@
         <w:pStyle w:val="FirstParagraph"/>
       </w:pPr>
       <w:r>
-        <w:t>The author</w:t>
-      </w:r>
-      <w:r>
-        <w:t xml:space="preserve"> set out to build and evaluate an automated system that generates </w:t>
-      </w:r>
-      <w:r>
-        <w:t xml:space="preserve">natural language semantic layers </w:t>
-      </w:r>
-      <w:r>
-        <w:t>for databases and measures whether these layers improve text-to-SQL query generation accuracy. The project aimed to:</w:t>
+        <w:t>The author set out to build and evaluate an automated system that generates natural language semantic layers for databases and measures whether these layers improve text-to-SQL query generation accuracy. The project aimed to:</w:t>
       </w:r>
     </w:p>
     <w:p>
@@ -963,13 +948,7 @@
         <w:rPr>
           <w:bCs/>
         </w:rPr>
-        <w:t>Time constraints force compromises</w:t>
-      </w:r>
-      <w:r>
-        <w:rPr>
-          <w:bCs/>
-        </w:rPr>
-        <w:t xml:space="preserve">. The 20 semantic layer documents I generated </w:t>
+        <w:t xml:space="preserve">Time constraints force compromises. The 20 semantic layer documents I generated </w:t>
       </w:r>
       <w:r>
         <w:rPr>
@@ -1438,13 +1417,7 @@
         <w:pStyle w:val="BodyText"/>
       </w:pPr>
       <w:r>
-        <w:t xml:space="preserve">This project used a single LLM model – </w:t>
-      </w:r>
-      <w:r>
-        <w:t>GPT-4o-mini</w:t>
-      </w:r>
-      <w:r>
-        <w:t xml:space="preserve">. As new models are released and pricing </w:t>
+        <w:t xml:space="preserve">This project used a single LLM model – GPT-4o-mini. As new models are released and pricing </w:t>
       </w:r>
       <w:proofErr w:type="gramStart"/>
       <w:r>
@@ -1452,13 +1425,7 @@
       </w:r>
       <w:proofErr w:type="gramEnd"/>
       <w:r>
-        <w:t xml:space="preserve"> I will experiment with more powerful LLM models. </w:t>
-      </w:r>
-      <w:r>
-        <w:t>GPT-4o-mini</w:t>
-      </w:r>
-      <w:r>
-        <w:t xml:space="preserve"> proved quite capable but there is a high likelihood that a more powerful model could provide several percentage points better benchmark performance.</w:t>
+        <w:t xml:space="preserve"> I will experiment with more powerful LLM models. GPT-4o-mini proved quite capable but there is a high likelihood that a more powerful model could provide several percentage points better benchmark performance.</w:t>
       </w:r>
     </w:p>
     <w:p>
@@ -1472,19 +1439,7 @@
         <w:rPr>
           <w:bCs/>
         </w:rPr>
-        <w:t>Replace automated semantic layer creation with a human assisted solution.</w:t>
-      </w:r>
-      <w:r>
-        <w:rPr>
-          <w:bCs/>
-        </w:rPr>
-        <w:t xml:space="preserve"> </w:t>
-      </w:r>
-      <w:r>
-        <w:rPr>
-          <w:bCs/>
-        </w:rPr>
-        <w:t>While the automated solution doesn’t add much value, a human analyst facilitated by proper tooling will undoubtedly provide significant accuracy improvements. The results of this would also provide quality input as examples for improving automated generation.</w:t>
+        <w:t>Replace automated semantic layer creation with a human assisted solution. While the automated solution doesn’t add much value, a human analyst facilitated by proper tooling will undoubtedly provide significant accuracy improvements. The results of this would also provide quality input as examples for improving automated generation.</w:t>
       </w:r>
     </w:p>
     <w:p>
@@ -1537,7 +1492,7 @@
         <w:pStyle w:val="Heading2"/>
       </w:pPr>
       <w:r>
-        <w:t>Repository</w:t>
+        <w:t>Deliverables</w:t>
       </w:r>
     </w:p>
     <w:p>
@@ -1570,19 +1525,7 @@
           <w:rPr>
             <w:rStyle w:val="Hyperlink"/>
           </w:rPr>
-          <w:t>https://querydawg.vercel.</w:t>
-        </w:r>
-        <w:r>
-          <w:rPr>
-            <w:rStyle w:val="Hyperlink"/>
-          </w:rPr>
-          <w:t>a</w:t>
-        </w:r>
-        <w:r>
-          <w:rPr>
-            <w:rStyle w:val="Hyperlink"/>
-          </w:rPr>
-          <w:t>pp</w:t>
+          <w:t>https://querydawg.vercel.app</w:t>
         </w:r>
       </w:hyperlink>
       <w:r>
@@ -1593,33 +1536,39 @@
           <w:rPr>
             <w:rStyle w:val="Hyperlink"/>
           </w:rPr>
-          <w:t>https://www.</w:t>
+          <w:t>https://www.querydawg.com</w:t>
         </w:r>
+      </w:hyperlink>
+      <w:r>
+        <w:t xml:space="preserve"> </w:t>
+      </w:r>
+    </w:p>
+    <w:p>
+      <w:pPr>
+        <w:pStyle w:val="BodyText"/>
+        <w:spacing w:before="0" w:after="0"/>
+        <w:ind w:left="720"/>
+      </w:pPr>
+      <w:r>
+        <w:t>Note: LLM calls are currently disabled to protect my API account.</w:t>
+      </w:r>
+    </w:p>
+    <w:p>
+      <w:pPr>
+        <w:pStyle w:val="BodyText"/>
+        <w:spacing w:before="0" w:after="0"/>
+      </w:pPr>
+      <w:r>
+        <w:t xml:space="preserve">Video Walkthrough: </w:t>
+      </w:r>
+      <w:hyperlink r:id="rId10" w:history="1">
         <w:r>
           <w:rPr>
             <w:rStyle w:val="Hyperlink"/>
           </w:rPr>
-          <w:t>q</w:t>
-        </w:r>
-        <w:r>
-          <w:rPr>
-            <w:rStyle w:val="Hyperlink"/>
-          </w:rPr>
-          <w:t>uerydawg.com</w:t>
+          <w:t>https://youtu.be/_BNwTsbmmMY</w:t>
         </w:r>
       </w:hyperlink>
-      <w:r>
-        <w:t xml:space="preserve"> </w:t>
-      </w:r>
-    </w:p>
-    <w:p>
-      <w:pPr>
-        <w:pStyle w:val="BodyText"/>
-        <w:spacing w:before="0" w:after="0"/>
-      </w:pPr>
-      <w:r>
-        <w:t>Note: LLM calls are currently disabled to protect my API account.</w:t>
-      </w:r>
     </w:p>
     <w:p>
       <w:pPr>
@@ -1633,7 +1582,7 @@
       <w:pPr>
         <w:pStyle w:val="Compact"/>
       </w:pPr>
-      <w:hyperlink r:id="rId10">
+      <w:hyperlink r:id="rId11">
         <w:r>
           <w:rPr>
             <w:rStyle w:val="Hyperlink"/>
@@ -1649,7 +1598,7 @@
       <w:pPr>
         <w:pStyle w:val="Compact"/>
       </w:pPr>
-      <w:hyperlink r:id="rId11">
+      <w:hyperlink r:id="rId12">
         <w:r>
           <w:rPr>
             <w:rStyle w:val="Hyperlink"/>
@@ -1665,7 +1614,7 @@
       <w:pPr>
         <w:pStyle w:val="Compact"/>
       </w:pPr>
-      <w:hyperlink r:id="rId12">
+      <w:hyperlink r:id="rId13">
         <w:r>
           <w:rPr>
             <w:rStyle w:val="Hyperlink"/>
@@ -1695,13 +1644,7 @@
       </w:r>
       <w:proofErr w:type="spellEnd"/>
       <w:r>
-        <w:t xml:space="preserve"> shows that automatically generating semantic layers is both technically possible and practically useful, though not quite in the way I</w:t>
-      </w:r>
-      <w:r>
-        <w:t xml:space="preserve"> </w:t>
-      </w:r>
-      <w:r>
-        <w:t>originally expected.</w:t>
+        <w:t xml:space="preserve"> shows that automatically generating semantic layers is both technically possible and practically useful, though not quite in the way I originally expected.</w:t>
       </w:r>
     </w:p>
     <w:p>
@@ -1715,19 +1658,7 @@
         <w:t xml:space="preserve">, </w:t>
       </w:r>
       <w:r>
-        <w:t>achieving 81.61%</w:t>
-      </w:r>
-      <w:r>
-        <w:t xml:space="preserve"> </w:t>
-      </w:r>
-      <w:r>
-        <w:t>accuracy without any additional context. This leaves less room for improvement than anticipated, but knowing this helps practitioners focus their</w:t>
-      </w:r>
-      <w:r>
-        <w:t xml:space="preserve"> </w:t>
-      </w:r>
-      <w:r>
-        <w:t>efforts where they'll have the most impact.</w:t>
+        <w:t>achieving 81.61% accuracy without any additional context. This leaves less room for improvement than anticipated, but knowing this helps practitioners focus their efforts where they'll have the most impact.</w:t>
       </w:r>
     </w:p>
     <w:p>
@@ -1735,22 +1666,7 @@
         <w:pStyle w:val="FirstParagraph"/>
       </w:pPr>
       <w:r>
-        <w:t>The project delivers value in multiple ways: the open-source code</w:t>
-      </w:r>
-      <w:r>
-        <w:t xml:space="preserve"> </w:t>
-      </w:r>
-      <w:r>
-        <w:t>and reproducible results provide a solid starting point for</w:t>
-      </w:r>
-      <w:r>
-        <w:t xml:space="preserve"> further research in</w:t>
-      </w:r>
-      <w:r>
-        <w:t xml:space="preserve"> text-to-SQL systems</w:t>
-      </w:r>
-      <w:r>
-        <w:t>.</w:t>
+        <w:t>The project delivers value in multiple ways: the open-source code and reproducible results provide a solid starting point for further research in text-to-SQL systems.</w:t>
       </w:r>
     </w:p>
     <w:p>
@@ -1758,31 +1674,13 @@
         <w:pStyle w:val="FirstParagraph"/>
       </w:pPr>
       <w:r>
-        <w:t>What I found most rewarding about this project wasn't confirming my original hypothesis</w:t>
-      </w:r>
-      <w:r>
-        <w:t xml:space="preserve">, it was the </w:t>
+        <w:t xml:space="preserve">What I found most rewarding about this project wasn't confirming my original hypothesis, it was the </w:t>
       </w:r>
       <w:r>
         <w:t xml:space="preserve">process and the </w:t>
       </w:r>
       <w:r>
-        <w:t>surprises.</w:t>
-      </w:r>
-      <w:r>
-        <w:t xml:space="preserve"> The strong baseline performance, the accuracy ceiling, the whack-a-mole effect where fixing one issue created anothe</w:t>
-      </w:r>
-      <w:r>
-        <w:t>r. In the long run, most importantly, the power of agentic development. T</w:t>
-      </w:r>
-      <w:r>
-        <w:t>hese unexpected findings taught me far more than</w:t>
-      </w:r>
-      <w:r>
-        <w:t xml:space="preserve"> </w:t>
-      </w:r>
-      <w:r>
-        <w:t>a straightforward validation ever would have.</w:t>
+        <w:t>surprises. The strong baseline performance, the accuracy ceiling, the whack-a-mole effect where fixing one issue created another. In the long run, most importantly, the power of agentic development. These unexpected findings taught me far more than a straightforward validation ever would have.</w:t>
       </w:r>
     </w:p>
     <w:sectPr>

</xml_diff>

<commit_message>
Rephrased some paragraphs. Other minor edits.
</commit_message>
<xml_diff>
--- a/docs/FINAL_SUMMARY.docx
+++ b/docs/FINAL_SUMMARY.docx
@@ -647,7 +647,31 @@
         <w:rPr>
           <w:bCs/>
         </w:rPr>
-        <w:t xml:space="preserve">Modern LLMs are remarkably capable at SQL generation. I expected baseline performance around 65-75%, but GPT-4o-mini achieved 81.61% from schema alone. This fundamentally changed my understanding of where semantic layers add value - they help at the margins, not as a </w:t>
+        <w:t xml:space="preserve">Modern LLMs are remarkably capable at SQL generation. I expected baseline performance around 65-75%, but GPT-4o-mini achieved 81.61% </w:t>
+      </w:r>
+      <w:r>
+        <w:rPr>
+          <w:bCs/>
+        </w:rPr>
+        <w:t>using</w:t>
+      </w:r>
+      <w:r>
+        <w:rPr>
+          <w:bCs/>
+        </w:rPr>
+        <w:t xml:space="preserve"> </w:t>
+      </w:r>
+      <w:r>
+        <w:rPr>
+          <w:bCs/>
+        </w:rPr>
+        <w:t>just the schema details.</w:t>
+      </w:r>
+      <w:r>
+        <w:rPr>
+          <w:bCs/>
+        </w:rPr>
+        <w:t xml:space="preserve"> This fundamentally changed my understanding of where semantic layers add value - they help at the margins, not as a </w:t>
       </w:r>
       <w:r>
         <w:rPr>
@@ -752,6 +776,12 @@
         </w:rPr>
         <w:t xml:space="preserve"> found no clear correlation. A 2-table database (singer) achieved only 60% while an 8-table database (dog_kennels) hit 79%. Domain clarity and naming conventions matter more than schema size.</w:t>
       </w:r>
+      <w:r>
+        <w:rPr>
+          <w:bCs/>
+        </w:rPr>
+        <w:t xml:space="preserve"> The keys to quality SQL output are consistency in column names and data types.</w:t>
+      </w:r>
     </w:p>
     <w:p>
       <w:pPr>
@@ -784,7 +814,19 @@
         <w:rPr>
           <w:bCs/>
         </w:rPr>
-        <w:t>How you define "correct" matters enormously.</w:t>
+        <w:t xml:space="preserve">How you define "correct" matters </w:t>
+      </w:r>
+      <w:r>
+        <w:rPr>
+          <w:bCs/>
+        </w:rPr>
+        <w:t>significantly</w:t>
+      </w:r>
+      <w:r>
+        <w:rPr>
+          <w:bCs/>
+        </w:rPr>
+        <w:t>.</w:t>
       </w:r>
       <w:r>
         <w:rPr>
@@ -966,7 +1008,14 @@
         <w:rPr>
           <w:bCs/>
         </w:rPr>
-        <w:t xml:space="preserve">. I spent almost all project time trying to optimize engine performance using the documentation as a functional artifact. The database schemas in the benchmark aren’t complicated enough to warrant significant documentation. </w:t>
+        <w:t xml:space="preserve">. I spent almost all project time trying to optimize engine performance using the documentation as a functional artifact. The database </w:t>
+      </w:r>
+      <w:r>
+        <w:rPr>
+          <w:bCs/>
+        </w:rPr>
+        <w:lastRenderedPageBreak/>
+        <w:t xml:space="preserve">schemas in the benchmark aren’t complicated enough to warrant significant documentation. </w:t>
       </w:r>
     </w:p>
     <w:p>
@@ -974,7 +1023,6 @@
         <w:pStyle w:val="Heading1"/>
       </w:pPr>
       <w:r>
-        <w:lastRenderedPageBreak/>
         <w:t>Big Takeaways</w:t>
       </w:r>
     </w:p>
@@ -1037,7 +1085,31 @@
         <w:pStyle w:val="BodyText"/>
       </w:pPr>
       <w:r>
-        <w:t>Variance: only 0.31% (3 questions). This suggests fundamental model limitations that cannot be overcome with prompt engineering or additional context alone. Breaking through may require larger models, fine-tuning, or architectural changes.</w:t>
+        <w:t xml:space="preserve">Variance: only 0.31% (3 questions). This suggests </w:t>
+      </w:r>
+      <w:r>
+        <w:t>basic</w:t>
+      </w:r>
+      <w:r>
+        <w:t xml:space="preserve"> model limitations that </w:t>
+      </w:r>
+      <w:r>
+        <w:t>can’t</w:t>
+      </w:r>
+      <w:r>
+        <w:t xml:space="preserve"> be overcome with prompt engineering or additional context alone. </w:t>
+      </w:r>
+      <w:r>
+        <w:t>A breakthrough</w:t>
+      </w:r>
+      <w:r>
+        <w:t xml:space="preserve"> </w:t>
+      </w:r>
+      <w:r>
+        <w:t>will</w:t>
+      </w:r>
+      <w:r>
+        <w:t xml:space="preserve"> require larger models, fine-tuning, or architectural changes.</w:t>
       </w:r>
     </w:p>
     <w:p>
@@ -1065,6 +1137,10 @@
     <w:p>
       <w:pPr>
         <w:pStyle w:val="Compact"/>
+        <w:numPr>
+          <w:ilvl w:val="0"/>
+          <w:numId w:val="28"/>
+        </w:numPr>
       </w:pPr>
       <w:r>
         <w:t>Ambiguous or inconsistent naming conventions</w:t>
@@ -1073,6 +1149,10 @@
     <w:p>
       <w:pPr>
         <w:pStyle w:val="Compact"/>
+        <w:numPr>
+          <w:ilvl w:val="0"/>
+          <w:numId w:val="28"/>
+        </w:numPr>
       </w:pPr>
       <w:r>
         <w:t>Complex multi-table joins with unclear relationships</w:t>
@@ -1081,6 +1161,10 @@
     <w:p>
       <w:pPr>
         <w:pStyle w:val="Compact"/>
+        <w:numPr>
+          <w:ilvl w:val="0"/>
+          <w:numId w:val="28"/>
+        </w:numPr>
       </w:pPr>
       <w:r>
         <w:t>Domain terminology that conflicts with common SQL patterns</w:t>
@@ -1119,6 +1203,10 @@
     <w:p>
       <w:pPr>
         <w:pStyle w:val="Compact"/>
+        <w:numPr>
+          <w:ilvl w:val="0"/>
+          <w:numId w:val="29"/>
+        </w:numPr>
       </w:pPr>
       <w:r>
         <w:t>Dual database support (SQLite for Spider native, PostgreSQL for production)</w:t>
@@ -1127,6 +1215,10 @@
     <w:p>
       <w:pPr>
         <w:pStyle w:val="Compact"/>
+        <w:numPr>
+          <w:ilvl w:val="0"/>
+          <w:numId w:val="29"/>
+        </w:numPr>
       </w:pPr>
       <w:r>
         <w:t>Comprehensive error handling and logging</w:t>
@@ -1135,6 +1227,10 @@
     <w:p>
       <w:pPr>
         <w:pStyle w:val="Compact"/>
+        <w:numPr>
+          <w:ilvl w:val="0"/>
+          <w:numId w:val="29"/>
+        </w:numPr>
       </w:pPr>
       <w:r>
         <w:t>Admin authentication for expensive operations</w:t>
@@ -1143,6 +1239,10 @@
     <w:p>
       <w:pPr>
         <w:pStyle w:val="Compact"/>
+        <w:numPr>
+          <w:ilvl w:val="0"/>
+          <w:numId w:val="29"/>
+        </w:numPr>
       </w:pPr>
       <w:r>
         <w:t>Cost tracking and budget controls</w:t>
@@ -1187,6 +1287,7 @@
         </w:numPr>
       </w:pPr>
       <w:r>
+        <w:lastRenderedPageBreak/>
         <w:t>Other researchers to reproduce my results exactly</w:t>
       </w:r>
     </w:p>
@@ -1235,7 +1336,6 @@
         </w:numPr>
       </w:pPr>
       <w:r>
-        <w:lastRenderedPageBreak/>
         <w:t>Reproducibility is a cornerstone of scientific research, and open source is how we achieve it in software-based research.</w:t>
       </w:r>
     </w:p>
@@ -1447,6 +1547,7 @@
         <w:pStyle w:val="Heading2"/>
       </w:pPr>
       <w:r>
+        <w:lastRenderedPageBreak/>
         <w:t>Continued Learning</w:t>
       </w:r>
     </w:p>
@@ -1483,7 +1584,6 @@
         <w:pStyle w:val="Heading1"/>
       </w:pPr>
       <w:r>
-        <w:lastRenderedPageBreak/>
         <w:t>Submitted Files</w:t>
       </w:r>
     </w:p>
@@ -1652,13 +1752,19 @@
         <w:pStyle w:val="FirstParagraph"/>
       </w:pPr>
       <w:r>
-        <w:t>One of the most important discoveries was that modern LLMs are already remarkably good at text-to-SQL using just the database schema</w:t>
-      </w:r>
-      <w:r>
-        <w:t xml:space="preserve">, </w:t>
-      </w:r>
-      <w:r>
-        <w:t>achieving 81.61% accuracy without any additional context. This leaves less room for improvement than anticipated, but knowing this helps practitioners focus their efforts where they'll have the most impact.</w:t>
+        <w:t xml:space="preserve">One of the key findings was that modern large language models (LLMs) are surprisingly effective at converting text to SQL queries using just the database schema. They achieved an impressive 81.61% accuracy without </w:t>
+      </w:r>
+      <w:r>
+        <w:t>additional</w:t>
+      </w:r>
+      <w:r>
+        <w:t xml:space="preserve"> context. While this means there's less room for improvement than initially thought, it helps focus </w:t>
+      </w:r>
+      <w:r>
+        <w:t>future</w:t>
+      </w:r>
+      <w:r>
+        <w:t xml:space="preserve"> efforts on areas where they can make the biggest difference.</w:t>
       </w:r>
     </w:p>
     <w:p>
@@ -1666,7 +1772,7 @@
         <w:pStyle w:val="FirstParagraph"/>
       </w:pPr>
       <w:r>
-        <w:t>The project delivers value in multiple ways: the open-source code and reproducible results provide a solid starting point for further research in text-to-SQL systems.</w:t>
+        <w:t>The project offers numerous benefits: the open-source code and reproducible results provide a strong foundation for further research in text-to-SQL systems.</w:t>
       </w:r>
     </w:p>
     <w:p>
@@ -2269,6 +2375,119 @@
     </w:lvl>
   </w:abstractNum>
   <w:abstractNum w:abstractNumId="6" w15:restartNumberingAfterBreak="0">
+    <w:nsid w:val="2350642A"/>
+    <w:multiLevelType w:val="hybridMultilevel"/>
+    <w:tmpl w:val="E9E23C78"/>
+    <w:lvl w:ilvl="0" w:tplc="04090001">
+      <w:start w:val="1"/>
+      <w:numFmt w:val="bullet"/>
+      <w:lvlText w:val=""/>
+      <w:lvlJc w:val="left"/>
+      <w:pPr>
+        <w:ind w:left="720" w:hanging="360"/>
+      </w:pPr>
+      <w:rPr>
+        <w:rFonts w:ascii="Symbol" w:hAnsi="Symbol" w:hint="default"/>
+      </w:rPr>
+    </w:lvl>
+    <w:lvl w:ilvl="1" w:tplc="04090003" w:tentative="1">
+      <w:start w:val="1"/>
+      <w:numFmt w:val="bullet"/>
+      <w:lvlText w:val="o"/>
+      <w:lvlJc w:val="left"/>
+      <w:pPr>
+        <w:ind w:left="1440" w:hanging="360"/>
+      </w:pPr>
+      <w:rPr>
+        <w:rFonts w:ascii="Courier New" w:hAnsi="Courier New" w:cs="Courier New" w:hint="default"/>
+      </w:rPr>
+    </w:lvl>
+    <w:lvl w:ilvl="2" w:tplc="04090005" w:tentative="1">
+      <w:start w:val="1"/>
+      <w:numFmt w:val="bullet"/>
+      <w:lvlText w:val=""/>
+      <w:lvlJc w:val="left"/>
+      <w:pPr>
+        <w:ind w:left="2160" w:hanging="360"/>
+      </w:pPr>
+      <w:rPr>
+        <w:rFonts w:ascii="Wingdings" w:hAnsi="Wingdings" w:hint="default"/>
+      </w:rPr>
+    </w:lvl>
+    <w:lvl w:ilvl="3" w:tplc="04090001" w:tentative="1">
+      <w:start w:val="1"/>
+      <w:numFmt w:val="bullet"/>
+      <w:lvlText w:val=""/>
+      <w:lvlJc w:val="left"/>
+      <w:pPr>
+        <w:ind w:left="2880" w:hanging="360"/>
+      </w:pPr>
+      <w:rPr>
+        <w:rFonts w:ascii="Symbol" w:hAnsi="Symbol" w:hint="default"/>
+      </w:rPr>
+    </w:lvl>
+    <w:lvl w:ilvl="4" w:tplc="04090003" w:tentative="1">
+      <w:start w:val="1"/>
+      <w:numFmt w:val="bullet"/>
+      <w:lvlText w:val="o"/>
+      <w:lvlJc w:val="left"/>
+      <w:pPr>
+        <w:ind w:left="3600" w:hanging="360"/>
+      </w:pPr>
+      <w:rPr>
+        <w:rFonts w:ascii="Courier New" w:hAnsi="Courier New" w:cs="Courier New" w:hint="default"/>
+      </w:rPr>
+    </w:lvl>
+    <w:lvl w:ilvl="5" w:tplc="04090005" w:tentative="1">
+      <w:start w:val="1"/>
+      <w:numFmt w:val="bullet"/>
+      <w:lvlText w:val=""/>
+      <w:lvlJc w:val="left"/>
+      <w:pPr>
+        <w:ind w:left="4320" w:hanging="360"/>
+      </w:pPr>
+      <w:rPr>
+        <w:rFonts w:ascii="Wingdings" w:hAnsi="Wingdings" w:hint="default"/>
+      </w:rPr>
+    </w:lvl>
+    <w:lvl w:ilvl="6" w:tplc="04090001" w:tentative="1">
+      <w:start w:val="1"/>
+      <w:numFmt w:val="bullet"/>
+      <w:lvlText w:val=""/>
+      <w:lvlJc w:val="left"/>
+      <w:pPr>
+        <w:ind w:left="5040" w:hanging="360"/>
+      </w:pPr>
+      <w:rPr>
+        <w:rFonts w:ascii="Symbol" w:hAnsi="Symbol" w:hint="default"/>
+      </w:rPr>
+    </w:lvl>
+    <w:lvl w:ilvl="7" w:tplc="04090003" w:tentative="1">
+      <w:start w:val="1"/>
+      <w:numFmt w:val="bullet"/>
+      <w:lvlText w:val="o"/>
+      <w:lvlJc w:val="left"/>
+      <w:pPr>
+        <w:ind w:left="5760" w:hanging="360"/>
+      </w:pPr>
+      <w:rPr>
+        <w:rFonts w:ascii="Courier New" w:hAnsi="Courier New" w:cs="Courier New" w:hint="default"/>
+      </w:rPr>
+    </w:lvl>
+    <w:lvl w:ilvl="8" w:tplc="04090005" w:tentative="1">
+      <w:start w:val="1"/>
+      <w:numFmt w:val="bullet"/>
+      <w:lvlText w:val=""/>
+      <w:lvlJc w:val="left"/>
+      <w:pPr>
+        <w:ind w:left="6480" w:hanging="360"/>
+      </w:pPr>
+      <w:rPr>
+        <w:rFonts w:ascii="Wingdings" w:hAnsi="Wingdings" w:hint="default"/>
+      </w:rPr>
+    </w:lvl>
+  </w:abstractNum>
+  <w:abstractNum w:abstractNumId="7" w15:restartNumberingAfterBreak="0">
     <w:nsid w:val="3CED0EF4"/>
     <w:multiLevelType w:val="hybridMultilevel"/>
     <w:tmpl w:val="640EF172"/>
@@ -2382,7 +2601,7 @@
       </w:rPr>
     </w:lvl>
   </w:abstractNum>
-  <w:abstractNum w:abstractNumId="7" w15:restartNumberingAfterBreak="0">
+  <w:abstractNum w:abstractNumId="8" w15:restartNumberingAfterBreak="0">
     <w:nsid w:val="41C31E0E"/>
     <w:multiLevelType w:val="hybridMultilevel"/>
     <w:tmpl w:val="4F0E4C10"/>
@@ -2471,7 +2690,7 @@
       </w:pPr>
     </w:lvl>
   </w:abstractNum>
-  <w:abstractNum w:abstractNumId="8" w15:restartNumberingAfterBreak="0">
+  <w:abstractNum w:abstractNumId="9" w15:restartNumberingAfterBreak="0">
     <w:nsid w:val="4A4D2AE6"/>
     <w:multiLevelType w:val="hybridMultilevel"/>
     <w:tmpl w:val="D93C8E7E"/>
@@ -2557,7 +2776,7 @@
       </w:pPr>
     </w:lvl>
   </w:abstractNum>
-  <w:abstractNum w:abstractNumId="9" w15:restartNumberingAfterBreak="0">
+  <w:abstractNum w:abstractNumId="10" w15:restartNumberingAfterBreak="0">
     <w:nsid w:val="5ACE514D"/>
     <w:multiLevelType w:val="hybridMultilevel"/>
     <w:tmpl w:val="A1689280"/>
@@ -2646,7 +2865,7 @@
       </w:pPr>
     </w:lvl>
   </w:abstractNum>
-  <w:abstractNum w:abstractNumId="10" w15:restartNumberingAfterBreak="0">
+  <w:abstractNum w:abstractNumId="11" w15:restartNumberingAfterBreak="0">
     <w:nsid w:val="5FEB06E3"/>
     <w:multiLevelType w:val="hybridMultilevel"/>
     <w:tmpl w:val="07103D32"/>
@@ -2735,7 +2954,120 @@
       </w:pPr>
     </w:lvl>
   </w:abstractNum>
-  <w:abstractNum w:abstractNumId="11" w15:restartNumberingAfterBreak="0">
+  <w:abstractNum w:abstractNumId="12" w15:restartNumberingAfterBreak="0">
+    <w:nsid w:val="7F396F18"/>
+    <w:multiLevelType w:val="hybridMultilevel"/>
+    <w:tmpl w:val="50DA5574"/>
+    <w:lvl w:ilvl="0" w:tplc="04090001">
+      <w:start w:val="1"/>
+      <w:numFmt w:val="bullet"/>
+      <w:lvlText w:val=""/>
+      <w:lvlJc w:val="left"/>
+      <w:pPr>
+        <w:ind w:left="720" w:hanging="360"/>
+      </w:pPr>
+      <w:rPr>
+        <w:rFonts w:ascii="Symbol" w:hAnsi="Symbol" w:hint="default"/>
+      </w:rPr>
+    </w:lvl>
+    <w:lvl w:ilvl="1" w:tplc="04090003" w:tentative="1">
+      <w:start w:val="1"/>
+      <w:numFmt w:val="bullet"/>
+      <w:lvlText w:val="o"/>
+      <w:lvlJc w:val="left"/>
+      <w:pPr>
+        <w:ind w:left="1440" w:hanging="360"/>
+      </w:pPr>
+      <w:rPr>
+        <w:rFonts w:ascii="Courier New" w:hAnsi="Courier New" w:cs="Courier New" w:hint="default"/>
+      </w:rPr>
+    </w:lvl>
+    <w:lvl w:ilvl="2" w:tplc="04090005" w:tentative="1">
+      <w:start w:val="1"/>
+      <w:numFmt w:val="bullet"/>
+      <w:lvlText w:val=""/>
+      <w:lvlJc w:val="left"/>
+      <w:pPr>
+        <w:ind w:left="2160" w:hanging="360"/>
+      </w:pPr>
+      <w:rPr>
+        <w:rFonts w:ascii="Wingdings" w:hAnsi="Wingdings" w:hint="default"/>
+      </w:rPr>
+    </w:lvl>
+    <w:lvl w:ilvl="3" w:tplc="04090001" w:tentative="1">
+      <w:start w:val="1"/>
+      <w:numFmt w:val="bullet"/>
+      <w:lvlText w:val=""/>
+      <w:lvlJc w:val="left"/>
+      <w:pPr>
+        <w:ind w:left="2880" w:hanging="360"/>
+      </w:pPr>
+      <w:rPr>
+        <w:rFonts w:ascii="Symbol" w:hAnsi="Symbol" w:hint="default"/>
+      </w:rPr>
+    </w:lvl>
+    <w:lvl w:ilvl="4" w:tplc="04090003" w:tentative="1">
+      <w:start w:val="1"/>
+      <w:numFmt w:val="bullet"/>
+      <w:lvlText w:val="o"/>
+      <w:lvlJc w:val="left"/>
+      <w:pPr>
+        <w:ind w:left="3600" w:hanging="360"/>
+      </w:pPr>
+      <w:rPr>
+        <w:rFonts w:ascii="Courier New" w:hAnsi="Courier New" w:cs="Courier New" w:hint="default"/>
+      </w:rPr>
+    </w:lvl>
+    <w:lvl w:ilvl="5" w:tplc="04090005" w:tentative="1">
+      <w:start w:val="1"/>
+      <w:numFmt w:val="bullet"/>
+      <w:lvlText w:val=""/>
+      <w:lvlJc w:val="left"/>
+      <w:pPr>
+        <w:ind w:left="4320" w:hanging="360"/>
+      </w:pPr>
+      <w:rPr>
+        <w:rFonts w:ascii="Wingdings" w:hAnsi="Wingdings" w:hint="default"/>
+      </w:rPr>
+    </w:lvl>
+    <w:lvl w:ilvl="6" w:tplc="04090001" w:tentative="1">
+      <w:start w:val="1"/>
+      <w:numFmt w:val="bullet"/>
+      <w:lvlText w:val=""/>
+      <w:lvlJc w:val="left"/>
+      <w:pPr>
+        <w:ind w:left="5040" w:hanging="360"/>
+      </w:pPr>
+      <w:rPr>
+        <w:rFonts w:ascii="Symbol" w:hAnsi="Symbol" w:hint="default"/>
+      </w:rPr>
+    </w:lvl>
+    <w:lvl w:ilvl="7" w:tplc="04090003" w:tentative="1">
+      <w:start w:val="1"/>
+      <w:numFmt w:val="bullet"/>
+      <w:lvlText w:val="o"/>
+      <w:lvlJc w:val="left"/>
+      <w:pPr>
+        <w:ind w:left="5760" w:hanging="360"/>
+      </w:pPr>
+      <w:rPr>
+        <w:rFonts w:ascii="Courier New" w:hAnsi="Courier New" w:cs="Courier New" w:hint="default"/>
+      </w:rPr>
+    </w:lvl>
+    <w:lvl w:ilvl="8" w:tplc="04090005" w:tentative="1">
+      <w:start w:val="1"/>
+      <w:numFmt w:val="bullet"/>
+      <w:lvlText w:val=""/>
+      <w:lvlJc w:val="left"/>
+      <w:pPr>
+        <w:ind w:left="6480" w:hanging="360"/>
+      </w:pPr>
+      <w:rPr>
+        <w:rFonts w:ascii="Wingdings" w:hAnsi="Wingdings" w:hint="default"/>
+      </w:rPr>
+    </w:lvl>
+  </w:abstractNum>
+  <w:abstractNum w:abstractNumId="13" w15:restartNumberingAfterBreak="0">
     <w:nsid w:val="7F99555B"/>
     <w:multiLevelType w:val="hybridMultilevel"/>
     <w:tmpl w:val="21562DD0"/>
@@ -3020,25 +3352,31 @@
     <w:abstractNumId w:val="3"/>
   </w:num>
   <w:num w:numId="21" w16cid:durableId="1347756821">
-    <w:abstractNumId w:val="7"/>
+    <w:abstractNumId w:val="8"/>
   </w:num>
   <w:num w:numId="22" w16cid:durableId="140774398">
-    <w:abstractNumId w:val="8"/>
+    <w:abstractNumId w:val="9"/>
   </w:num>
   <w:num w:numId="23" w16cid:durableId="1837265815">
+    <w:abstractNumId w:val="11"/>
+  </w:num>
+  <w:num w:numId="24" w16cid:durableId="1180194383">
     <w:abstractNumId w:val="10"/>
   </w:num>
-  <w:num w:numId="24" w16cid:durableId="1180194383">
-    <w:abstractNumId w:val="9"/>
-  </w:num>
   <w:num w:numId="25" w16cid:durableId="886571494">
-    <w:abstractNumId w:val="11"/>
+    <w:abstractNumId w:val="13"/>
   </w:num>
   <w:num w:numId="26" w16cid:durableId="157507014">
-    <w:abstractNumId w:val="6"/>
+    <w:abstractNumId w:val="7"/>
   </w:num>
   <w:num w:numId="27" w16cid:durableId="1002926825">
     <w:abstractNumId w:val="5"/>
+  </w:num>
+  <w:num w:numId="28" w16cid:durableId="1893223522">
+    <w:abstractNumId w:val="12"/>
+  </w:num>
+  <w:num w:numId="29" w16cid:durableId="1066952127">
+    <w:abstractNumId w:val="6"/>
   </w:num>
 </w:numbering>
 </file>

</xml_diff>